<commit_message>
Release lightweight balance mod 0.6.4
</commit_message>
<xml_diff>
--- a/ZYL_LightweightBalance/docs/ZYL轻量化平衡模组_修改大全_微信版_无编号版.docx
+++ b/ZYL_LightweightBalance/docs/ZYL轻量化平衡模组_修改大全_微信版_无编号版.docx
@@ -38,7 +38,7 @@
         <w:widowControl/>
       </w:pPr>
       <w:r>
-        <w:t>当前版本：0.6.3</w:t>
+        <w:t>当前版本：0.6.4</w:t>
       </w:r>
     </w:p>
     <w:p>
@@ -146,7 +146,7 @@
         <w:widowControl/>
       </w:pPr>
       <w:r>
-        <w:t>总督</w:t>
+        <w:t>可选地图</w:t>
       </w:r>
     </w:p>
     <w:p>
@@ -157,6 +157,17 @@
         <w:widowControl/>
       </w:pPr>
       <w:r>
+        <w:t>总督</w:t>
+      </w:r>
+    </w:p>
+    <w:p>
+      <w:pPr>
+        <w:pStyle w:val="MobileDirectory"/>
+        <w:keepNext w:val="0"/>
+        <w:keepLines/>
+        <w:widowControl/>
+      </w:pPr>
+      <w:r>
         <w:t>兼容性与实测</w:t>
       </w:r>
     </w:p>
@@ -169,6 +180,83 @@
       </w:pPr>
       <w:r>
         <w:t>城市与经济</w:t>
+      </w:r>
+    </w:p>
+    <w:p>
+      <w:pPr>
+        <w:pStyle w:val="Heading2"/>
+        <w:keepNext/>
+        <w:keepLines w:val="0"/>
+        <w:widowControl/>
+      </w:pPr>
+      <w:r>
+        <w:t>时代长度优化</w:t>
+      </w:r>
+    </w:p>
+    <w:p>
+      <w:pPr>
+        <w:pStyle w:val="MobileDetail"/>
+        <w:keepNext w:val="0"/>
+        <w:keepLines/>
+        <w:widowControl/>
+      </w:pPr>
+      <w:r>
+        <w:t>大厅新增“时代长度优化”开关，默认关闭。</w:t>
+      </w:r>
+    </w:p>
+    <w:p>
+      <w:pPr>
+        <w:pStyle w:val="MobileDetail"/>
+        <w:keepNext w:val="0"/>
+        <w:keepLines/>
+        <w:widowControl/>
+      </w:pPr>
+      <w:r>
+        <w:t>开启后，标准速度下的世界时代范围为：远古30-50回合、古典50-60回合、中世纪40-60回合、文艺复兴至信息时代30-60回合。</w:t>
+      </w:r>
+    </w:p>
+    <w:p>
+      <w:pPr>
+        <w:pStyle w:val="MobileDetail"/>
+        <w:keepNext w:val="0"/>
+        <w:keepLines/>
+        <w:widowControl/>
+      </w:pPr>
+      <w:r>
+        <w:t>联机速度下依次为：远古15-25回合、古典25-30回合、中世纪20-30回合、文艺复兴至信息时代15-30回合。</w:t>
+      </w:r>
+    </w:p>
+    <w:p>
+      <w:pPr>
+        <w:pStyle w:val="Heading2"/>
+        <w:keepNext/>
+        <w:keepLines w:val="0"/>
+        <w:widowControl/>
+      </w:pPr>
+      <w:r>
+        <w:t>宗教数量上限</w:t>
+      </w:r>
+    </w:p>
+    <w:p>
+      <w:pPr>
+        <w:pStyle w:val="MobileDetail"/>
+        <w:keepNext w:val="0"/>
+        <w:keepLines/>
+        <w:widowControl/>
+      </w:pPr>
+      <w:r>
+        <w:t>所有地图尺寸最多均可招募 7 名大预言家，即最多可创立 7 个宗教。</w:t>
+      </w:r>
+    </w:p>
+    <w:p>
+      <w:pPr>
+        <w:pStyle w:val="MobileDetail"/>
+        <w:keepNext w:val="0"/>
+        <w:keepLines/>
+        <w:widowControl/>
+      </w:pPr>
+      <w:r>
+        <w:t>每个文明仍只能创立一个宗教；参赛且可发教的文明不足 7 个时，实际宗教数量也会少于 7 个。</w:t>
       </w:r>
     </w:p>
     <w:p>
@@ -1858,7 +1946,7 @@
         <w:widowControl/>
       </w:pPr>
       <w:r>
-        <w:t>宫殿额外 +2 住房，即首都额外 +2 住房。</w:t>
+        <w:t>所有玛雅城市额外 +1 住房，宫殿总计提供 +2 住房。</w:t>
       </w:r>
     </w:p>
     <w:p>
@@ -1869,7 +1957,7 @@
         <w:widowControl/>
       </w:pPr>
       <w:r>
-        <w:t>“穆塔尔忠烈之女”的近首都范围由 6 单元格扩大到 8 单元格。</w:t>
+        <w:t>首都坐地时拥有 5 住房，分城落地时拥有 3 住房。</w:t>
       </w:r>
     </w:p>
     <w:p>
@@ -1880,7 +1968,7 @@
         <w:widowControl/>
       </w:pPr>
       <w:r>
-        <w:t>首都 8 单元格内的非首都城市获得 +10% 全产出，并在建立时获得建造者。</w:t>
+        <w:t>“穆塔尔忠烈之女”的近首都范围由 6 单元格扩大到 8 单元格。</w:t>
       </w:r>
     </w:p>
     <w:p>
@@ -1891,7 +1979,7 @@
         <w:widowControl/>
       </w:pPr>
       <w:r>
-        <w:t>首都 8 单元格内的单位获得 +5 战斗力。</w:t>
+        <w:t>首都 8 单元格内的非首都城市获得 +10% 全产出，并在建立时获得建造者。</w:t>
       </w:r>
     </w:p>
     <w:p>
@@ -1902,7 +1990,7 @@
         <w:widowControl/>
       </w:pPr>
       <w:r>
-        <w:t>远城 -15% 全产出惩罚从距离首都 9 单元格开始。</w:t>
+        <w:t>首都 8 单元格内的单位获得 +5 战斗力。</w:t>
       </w:r>
     </w:p>
     <w:p>
@@ -1913,7 +2001,40 @@
         <w:widowControl/>
       </w:pPr>
       <w:r>
+        <w:t>远城 -15% 全产出惩罚从距离首都 9 单元格开始。</w:t>
+      </w:r>
+    </w:p>
+    <w:p>
+      <w:pPr>
+        <w:pStyle w:val="MobileDetail"/>
+        <w:keepNext w:val="0"/>
+        <w:keepLines/>
+        <w:widowControl/>
+      </w:pPr>
+      <w:r>
         <w:t>只有玛雅的建造者可以在解锁“土木工程”市政前，于草原丘陵和平原丘陵上修建农场。</w:t>
+      </w:r>
+    </w:p>
+    <w:p>
+      <w:pPr>
+        <w:pStyle w:val="Heading2"/>
+        <w:keepNext/>
+        <w:keepLines w:val="0"/>
+        <w:widowControl/>
+      </w:pPr>
+      <w:r>
+        <w:t>印度尼西亚</w:t>
+      </w:r>
+    </w:p>
+    <w:p>
+      <w:pPr>
+        <w:pStyle w:val="MobileDetail"/>
+        <w:keepNext w:val="0"/>
+        <w:keepLines/>
+        <w:widowControl/>
+      </w:pPr>
+      <w:r>
+        <w:t>每个相邻海岸或湖泊单元格为圣地提供 +1 信仰相邻加成。</w:t>
       </w:r>
     </w:p>
     <w:p>
@@ -1924,7 +2045,7 @@
         <w:widowControl/>
       </w:pPr>
       <w:r>
-        <w:t>总督</w:t>
+        <w:t>可选地图</w:t>
       </w:r>
     </w:p>
     <w:p>
@@ -1935,7 +2056,7 @@
         <w:widowControl/>
       </w:pPr>
       <w:r>
-        <w:t>就职时间</w:t>
+        <w:t>富饶竖向大陆（修复版）</w:t>
       </w:r>
     </w:p>
     <w:p>
@@ -1946,7 +2067,7 @@
         <w:widowControl/>
       </w:pPr>
       <w:r>
-        <w:t>平伽拉：5 回合。</w:t>
+        <w:t>仅在风云变幻规则集中显示，未选择时不会加载地图专属脚本。</w:t>
       </w:r>
     </w:p>
     <w:p>
@@ -1957,7 +2078,7 @@
         <w:widowControl/>
       </w:pPr>
       <w:r>
-        <w:t>马格努斯：3 回合。</w:t>
+        <w:t>纵向富饶大陆，东西海域较宽；默认东西分队出生，也可选择南北或随机方向。</w:t>
       </w:r>
     </w:p>
     <w:p>
@@ -1968,7 +2089,7 @@
         <w:widowControl/>
       </w:pPr>
       <w:r>
-        <w:t>维克多：3 回合。</w:t>
+        <w:t>提供 2、4、6、8、10、12、14、16、18 人共 9 档地图尺寸。</w:t>
       </w:r>
     </w:p>
     <w:p>
@@ -1979,7 +2100,7 @@
         <w:widowControl/>
       </w:pPr>
       <w:r>
-        <w:t>梁：3 回合。</w:t>
+        <w:t>城邦最大数量按原版对应尺寸放宽为 6、10、10、14、18、22、24、24、24。</w:t>
       </w:r>
     </w:p>
     <w:p>
@@ -1990,7 +2111,7 @@
         <w:widowControl/>
       </w:pPr>
       <w:r>
-        <w:t>瑞纳：3 回合。</w:t>
+        <w:t>大厅可选择“单机”或“联机”城邦放置规则；默认联机，只改变城邦，不改变主要文明出生。</w:t>
       </w:r>
     </w:p>
     <w:p>
@@ -2001,7 +2122,7 @@
         <w:widowControl/>
       </w:pPr>
       <w:r>
-        <w:t>阿玛尼：3 回合。</w:t>
+        <w:t>单机使用原版城邦间距和后备地块，联机保留原地图的严格 Team PVP 规则。</w:t>
       </w:r>
     </w:p>
     <w:p>
@@ -2012,7 +2133,7 @@
         <w:widowControl/>
       </w:pPr>
       <w:r>
-        <w:t>莫克夏：3 回合。</w:t>
+        <w:t>东西对抗时，每队的内陆文明和海岸文明分别沿南北方向平均划分出生带；南北对抗时改为沿东西方向划分。</w:t>
       </w:r>
     </w:p>
     <w:p>
@@ -2023,7 +2144,172 @@
         <w:widowControl/>
       </w:pPr>
       <w:r>
-        <w:t>易卜拉欣：3 回合，仅风云变幻规则集存在。</w:t>
+        <w:t>每类文明各占用自己的出生带，并在带内继续遵循原有地形、河流、资源和距离倾向。</w:t>
+      </w:r>
+    </w:p>
+    <w:p>
+      <w:pPr>
+        <w:pStyle w:val="MobileDetail"/>
+        <w:keepNext w:val="0"/>
+        <w:keepLines/>
+        <w:widowControl/>
+      </w:pPr>
+      <w:r>
+        <w:t>毛利等海洋出生文明不参与出生带或队伍侧筛选，继续使用地图原有的海洋出生机制。</w:t>
+      </w:r>
+    </w:p>
+    <w:p>
+      <w:pPr>
+        <w:pStyle w:val="MobileDetail"/>
+        <w:keepNext w:val="0"/>
+        <w:keepLines/>
+        <w:widowControl/>
+      </w:pPr>
+      <w:r>
+        <w:t>本地图会按尺寸禁止毛利出生在南北边缘：2/4/6/8 人图避开各 5 格，10 人图避开 6 格，12 人图避开 7 格，14/16/18 人图避开 8 格；不限制东西边缘。</w:t>
+      </w:r>
+    </w:p>
+    <w:p>
+      <w:pPr>
+        <w:pStyle w:val="MobileDetail"/>
+        <w:keepNext w:val="0"/>
+        <w:keepLines/>
+        <w:widowControl/>
+      </w:pPr>
+      <w:r>
+        <w:t>出生带会在多次生成失败后逐级放宽，并在放置结束后检查分布；随机出生和其他非对抗模式保持原算法。</w:t>
+      </w:r>
+    </w:p>
+    <w:p>
+      <w:pPr>
+        <w:pStyle w:val="MobileDetail"/>
+        <w:keepNext w:val="0"/>
+        <w:keepLines/>
+        <w:widowControl/>
+      </w:pPr>
+      <w:r>
+        <w:t>地图宽度可减少或增加最多 8 列；可选择不预铺道路，或预铺远古时代道路、古典时代道路、工业道路、现代道路或铁路。</w:t>
+      </w:r>
+    </w:p>
+    <w:p>
+      <w:pPr>
+        <w:pStyle w:val="MobileDetail"/>
+        <w:keepNext w:val="0"/>
+        <w:keepLines/>
+        <w:widowControl/>
+      </w:pPr>
+      <w:r>
+        <w:t>富饶度可设为 1-10；竞赛模式固定为 3，并以至少 6 格间距分布地脉。</w:t>
+      </w:r>
+    </w:p>
+    <w:p>
+      <w:pPr>
+        <w:pStyle w:val="MobileDetail"/>
+        <w:keepNext w:val="0"/>
+        <w:keepLines/>
+        <w:widowControl/>
+      </w:pPr>
+      <w:r>
+        <w:t>使用修复后的 BBS 衍生资源、出生点与重算算法，保留火山并恢复大型湖泊。</w:t>
+      </w:r>
+    </w:p>
+    <w:p>
+      <w:pPr>
+        <w:pStyle w:val="MobileDetail"/>
+        <w:keepNext w:val="0"/>
+        <w:keepLines/>
+        <w:widowControl/>
+      </w:pPr>
+      <w:r>
+        <w:t>海岸出生倾向判断已修正；海岸文明正常靠海，其他文明强烈偏好内陆。</w:t>
+      </w:r>
+    </w:p>
+    <w:p>
+      <w:pPr>
+        <w:pStyle w:val="MobileDetail"/>
+        <w:keepNext w:val="0"/>
+        <w:keepLines/>
+        <w:widowControl/>
+      </w:pPr>
+      <w:r>
+        <w:t>南北区域不再被坐标规则错误视为虚拟冻土，普通文明可以正常使用没有真实冻土的高纬区域。</w:t>
+      </w:r>
+    </w:p>
+    <w:p>
+      <w:pPr>
+        <w:pStyle w:val="MobileDetail"/>
+        <w:keepNext w:val="0"/>
+        <w:keepLines/>
+        <w:widowControl/>
+      </w:pPr>
+      <w:r>
+        <w:t>分队越界扣分由 9000 万提高到 1.2 亿，普通文明更难出生到对方区域。</w:t>
+      </w:r>
+    </w:p>
+    <w:p>
+      <w:pPr>
+        <w:pStyle w:val="MobileDetail"/>
+        <w:keepNext w:val="0"/>
+        <w:keepLines/>
+        <w:widowControl/>
+      </w:pPr>
+      <w:r>
+        <w:t>不再生成纬度冰盖和远洋冰岛。</w:t>
+      </w:r>
+    </w:p>
+    <w:p>
+      <w:pPr>
+        <w:pStyle w:val="MobileDetail"/>
+        <w:keepNext w:val="0"/>
+        <w:keepLines/>
+        <w:widowControl/>
+      </w:pPr>
+      <w:r>
+        <w:t>地图仍遵循本模组的最多 7 个宗教和地脉密度 +20% 规则。</w:t>
+      </w:r>
+    </w:p>
+    <w:p>
+      <w:pPr>
+        <w:pStyle w:val="MobileDetail"/>
+        <w:keepNext w:val="0"/>
+        <w:keepLines/>
+        <w:widowControl/>
+      </w:pPr>
+      <w:r>
+        <w:t>竞赛模式开关和“极多”战略资源档已修复；出生点重塑会保护全部战略资源与地脉，原地图中会阻止 Lua 加载的损坏日志也已修复。</w:t>
+      </w:r>
+    </w:p>
+    <w:p>
+      <w:pPr>
+        <w:pStyle w:val="MobileDetail"/>
+        <w:keepNext w:val="0"/>
+        <w:keepLines/>
+        <w:widowControl/>
+      </w:pPr>
+      <w:r>
+        <w:t>毛利水域出生格和地图边缘空相邻格不会再触发淡水修整崩溃。</w:t>
+      </w:r>
+    </w:p>
+    <w:p>
+      <w:pPr>
+        <w:pStyle w:val="MobileDetail"/>
+        <w:keepNext w:val="0"/>
+        <w:keepLines/>
+        <w:widowControl/>
+      </w:pPr>
+      <w:r>
+        <w:t>原作者：千川白浪、号码菌、红魔族首席魔法师。</w:t>
+      </w:r>
+    </w:p>
+    <w:p>
+      <w:pPr>
+        <w:pStyle w:val="Heading1"/>
+        <w:keepNext/>
+        <w:keepLines w:val="0"/>
+        <w:widowControl/>
+      </w:pPr>
+      <w:r>
+        <w:t>总督</w:t>
       </w:r>
     </w:p>
     <w:p>
@@ -2034,6 +2320,105 @@
         <w:widowControl/>
       </w:pPr>
       <w:r>
+        <w:t>就职时间</w:t>
+      </w:r>
+    </w:p>
+    <w:p>
+      <w:pPr>
+        <w:pStyle w:val="MobileDetail"/>
+        <w:keepNext w:val="0"/>
+        <w:keepLines/>
+        <w:widowControl/>
+      </w:pPr>
+      <w:r>
+        <w:t>平伽拉：5 回合。</w:t>
+      </w:r>
+    </w:p>
+    <w:p>
+      <w:pPr>
+        <w:pStyle w:val="MobileDetail"/>
+        <w:keepNext w:val="0"/>
+        <w:keepLines/>
+        <w:widowControl/>
+      </w:pPr>
+      <w:r>
+        <w:t>马格努斯：3 回合。</w:t>
+      </w:r>
+    </w:p>
+    <w:p>
+      <w:pPr>
+        <w:pStyle w:val="MobileDetail"/>
+        <w:keepNext w:val="0"/>
+        <w:keepLines/>
+        <w:widowControl/>
+      </w:pPr>
+      <w:r>
+        <w:t>维克多：3 回合。</w:t>
+      </w:r>
+    </w:p>
+    <w:p>
+      <w:pPr>
+        <w:pStyle w:val="MobileDetail"/>
+        <w:keepNext w:val="0"/>
+        <w:keepLines/>
+        <w:widowControl/>
+      </w:pPr>
+      <w:r>
+        <w:t>梁：3 回合。</w:t>
+      </w:r>
+    </w:p>
+    <w:p>
+      <w:pPr>
+        <w:pStyle w:val="MobileDetail"/>
+        <w:keepNext w:val="0"/>
+        <w:keepLines/>
+        <w:widowControl/>
+      </w:pPr>
+      <w:r>
+        <w:t>瑞纳：3 回合。</w:t>
+      </w:r>
+    </w:p>
+    <w:p>
+      <w:pPr>
+        <w:pStyle w:val="MobileDetail"/>
+        <w:keepNext w:val="0"/>
+        <w:keepLines/>
+        <w:widowControl/>
+      </w:pPr>
+      <w:r>
+        <w:t>阿玛尼：3 回合。</w:t>
+      </w:r>
+    </w:p>
+    <w:p>
+      <w:pPr>
+        <w:pStyle w:val="MobileDetail"/>
+        <w:keepNext w:val="0"/>
+        <w:keepLines/>
+        <w:widowControl/>
+      </w:pPr>
+      <w:r>
+        <w:t>莫克夏：3 回合。</w:t>
+      </w:r>
+    </w:p>
+    <w:p>
+      <w:pPr>
+        <w:pStyle w:val="MobileDetail"/>
+        <w:keepNext w:val="0"/>
+        <w:keepLines/>
+        <w:widowControl/>
+      </w:pPr>
+      <w:r>
+        <w:t>易卜拉欣：3 回合，仅风云变幻规则集存在。</w:t>
+      </w:r>
+    </w:p>
+    <w:p>
+      <w:pPr>
+        <w:pStyle w:val="Heading2"/>
+        <w:keepNext/>
+        <w:keepLines w:val="0"/>
+        <w:widowControl/>
+      </w:pPr>
+      <w:r>
         <w:t>马格努斯</w:t>
       </w:r>
     </w:p>
@@ -2962,6 +3347,39 @@
     </w:p>
     <w:p>
       <w:pPr>
+        <w:pStyle w:val="MobileDetail"/>
+        <w:keepNext w:val="0"/>
+        <w:keepLines/>
+        <w:widowControl/>
+      </w:pPr>
+      <w:r>
+        <w:t>印度尼西亚调整仅在启用印度尼西亚与高棉文明及情景包时加载。</w:t>
+      </w:r>
+    </w:p>
+    <w:p>
+      <w:pPr>
+        <w:pStyle w:val="MobileDetail"/>
+        <w:keepNext w:val="0"/>
+        <w:keepLines/>
+        <w:widowControl/>
+      </w:pPr>
+      <w:r>
+        <w:t>“时代长度优化”仅在迭起兴衰和风云变幻规则集中显示并生效。</w:t>
+      </w:r>
+    </w:p>
+    <w:p>
+      <w:pPr>
+        <w:pStyle w:val="MobileDetail"/>
+        <w:keepNext w:val="0"/>
+        <w:keepLines/>
+        <w:widowControl/>
+      </w:pPr>
+      <w:r>
+        <w:t>“富饶竖向大陆（修复版）”仅在风云变幻规则集中显示。</w:t>
+      </w:r>
+    </w:p>
+    <w:p>
+      <w:pPr>
         <w:pStyle w:val="Heading2"/>
         <w:keepNext/>
         <w:keepLines w:val="0"/>
@@ -3056,7 +3474,7 @@
         <w:widowControl/>
       </w:pPr>
       <w:r>
-        <w:t>使用玛雅确认首都额外住房、8 环边界和土木工程前丘陵农场均正确生效，并确认其他文明不能提前修建丘陵农场。</w:t>
+        <w:t>使用玛雅确认首都坐地时为 5 住房、分城落地时为 3 住房、8 环边界和土木工程前丘陵农场均正确生效，并确认其他文明不能提前修建丘陵农场。</w:t>
       </w:r>
     </w:p>
     <w:p>
@@ -3067,7 +3485,7 @@
         <w:widowControl/>
       </w:pPr>
       <w:r>
-        <w:t>确认采矿业解锁后可在地热裂缝上修建矿山，且裂缝仍然保留。</w:t>
+        <w:t>使用印度尼西亚确认圣地从每个相邻海岸或湖泊单元格获得 +1 信仰。</w:t>
       </w:r>
     </w:p>
     <w:p>
@@ -3078,7 +3496,7 @@
         <w:widowControl/>
       </w:pPr>
       <w:r>
-        <w:t>确认新地图中的地脉密度相对原版提高约 20%；地脉、奢侈资源和战略资源可以在正确条件下收获，并在其上坐城时继续保留。</w:t>
+        <w:t>确认采矿业解锁后可在地热裂缝上修建矿山，且裂缝仍然保留。</w:t>
       </w:r>
     </w:p>
     <w:p>
@@ -3089,7 +3507,7 @@
         <w:widowControl/>
       </w:pPr>
       <w:r>
-        <w:t>确认三层标准城墙的累计外部防御生命值依次为 50、100、150，格鲁吉亚城堡路线和“钢铁”都市防御均为 200。</w:t>
+        <w:t>确认新地图中的地脉密度相对原版提高约 20%；地脉、奢侈资源和战略资源可以在正确条件下收获，并在其上坐城时继续保留。</w:t>
       </w:r>
     </w:p>
     <w:p>
@@ -3100,7 +3518,95 @@
         <w:widowControl/>
       </w:pPr>
       <w:r>
+        <w:t>确认三层标准城墙的累计外部防御生命值依次为 50、100、150，格鲁吉亚城堡路线和“钢铁”都市防御均为 200。</w:t>
+      </w:r>
+    </w:p>
+    <w:p>
+      <w:pPr>
+        <w:pStyle w:val="MobileDetail"/>
+        <w:keepNext w:val="0"/>
+        <w:keepLines/>
+        <w:widowControl/>
+      </w:pPr>
+      <w:r>
         <w:t>确认军事工程师修建四类普通道路时每格消耗 1 点铁且不消耗建造次数。</w:t>
+      </w:r>
+    </w:p>
+    <w:p>
+      <w:pPr>
+        <w:pStyle w:val="MobileDetail"/>
+        <w:keepNext w:val="0"/>
+        <w:keepLines/>
+        <w:widowControl/>
+      </w:pPr>
+      <w:r>
+        <w:t>在大厅中分别关闭和开启“时代长度优化”，确认原版范围和优化范围可以正确切换，并在联机房间中同步。</w:t>
+      </w:r>
+    </w:p>
+    <w:p>
+      <w:pPr>
+        <w:pStyle w:val="MobileDetail"/>
+        <w:keepNext w:val="0"/>
+        <w:keepLines/>
+        <w:widowControl/>
+      </w:pPr>
+      <w:r>
+        <w:t>使用不同地图尺寸确认大预言家池上限均为 7，并确认每个文明仍只能创立一个宗教。</w:t>
+      </w:r>
+    </w:p>
+    <w:p>
+      <w:pPr>
+        <w:pStyle w:val="MobileDetail"/>
+        <w:keepNext w:val="0"/>
+        <w:keepLines/>
+        <w:widowControl/>
+      </w:pPr>
+      <w:r>
+        <w:t>选择“富饶竖向大陆（修复版）”生成非方形地图，确认 9 档尺寸、原版城邦数量范围及各大厅选项可用，火山、湖泊、资源、出生点和全图道路正常生成，地图中不再出现冰盖。</w:t>
+      </w:r>
+    </w:p>
+    <w:p>
+      <w:pPr>
+        <w:pStyle w:val="MobileDetail"/>
+        <w:keepNext w:val="0"/>
+        <w:keepLines/>
+        <w:widowControl/>
+      </w:pPr>
+      <w:r>
+        <w:t>分别用东西和南北分队生成多张地图，确认文明可使用没有真实冻土的南北区域、普通文明极少越过队伍分区，且海岸出生倾向文明正常靠海。</w:t>
+      </w:r>
+    </w:p>
+    <w:p>
+      <w:pPr>
+        <w:pStyle w:val="MobileDetail"/>
+        <w:keepNext w:val="0"/>
+        <w:keepLines/>
+        <w:widowControl/>
+      </w:pPr>
+      <w:r>
+        <w:t>在东西和南北对抗中混合内陆、海岸和毛利文明，确认陆地文明按出生带分布，毛利继续使用原海洋出生机制、不会落入当前尺寸的南北禁区，且边缘出生不会中止地图生成。</w:t>
+      </w:r>
+    </w:p>
+    <w:p>
+      <w:pPr>
+        <w:pStyle w:val="MobileDetail"/>
+        <w:keepNext w:val="0"/>
+        <w:keepLines/>
+        <w:widowControl/>
+      </w:pPr>
+      <w:r>
+        <w:t>使用随机出生确认不会启用文明出生带或分布验证。</w:t>
+      </w:r>
+    </w:p>
+    <w:p>
+      <w:pPr>
+        <w:pStyle w:val="MobileDetail"/>
+        <w:keepNext w:val="0"/>
+        <w:keepLines/>
+        <w:widowControl/>
+      </w:pPr>
+      <w:r>
+        <w:t>分别使用“单机”和“联机”城邦规则生成地图，确认单机使用原版间距与后备地块、联机保持严格规则，且主要文明出生逻辑不受切换影响。</w:t>
       </w:r>
     </w:p>
     <w:sectPr>

</xml_diff>

<commit_message>
Release ZYL Lightweight Balance 0.7.0
</commit_message>
<xml_diff>
--- a/ZYL_LightweightBalance/docs/ZYL轻量化平衡模组_修改大全_微信版_无编号版.docx
+++ b/ZYL_LightweightBalance/docs/ZYL轻量化平衡模组_修改大全_微信版_无编号版.docx
@@ -38,7 +38,7 @@
         <w:widowControl/>
       </w:pPr>
       <w:r>
-        <w:t>当前版本：0.6.4</w:t>
+        <w:t>当前版本：0.7.0</w:t>
       </w:r>
     </w:p>
     <w:p>
@@ -311,7 +311,7 @@
         <w:widowControl/>
       </w:pPr>
       <w:r>
-        <w:t>每个区域 +2 文化。</w:t>
+        <w:t>每个特色区域 +2 文化、+1 生产力、+2 金币。</w:t>
       </w:r>
     </w:p>
     <w:p>
@@ -465,6 +465,72 @@
         <w:widowControl/>
       </w:pPr>
       <w:r>
+        <w:t>港口线</w:t>
+      </w:r>
+    </w:p>
+    <w:p>
+      <w:pPr>
+        <w:pStyle w:val="MobileDetail"/>
+        <w:keepNext w:val="0"/>
+        <w:keepLines/>
+        <w:widowControl/>
+      </w:pPr>
+      <w:r>
+        <w:t>港口及特色港口区域提供 +2 住房。</w:t>
+      </w:r>
+    </w:p>
+    <w:p>
+      <w:pPr>
+        <w:pStyle w:val="MobileDetail"/>
+        <w:keepNext w:val="0"/>
+        <w:keepLines/>
+        <w:widowControl/>
+      </w:pPr>
+      <w:r>
+        <w:t>灯塔及灯塔替代建筑不再提供住房，其他灯塔效果保留。</w:t>
+      </w:r>
+    </w:p>
+    <w:p>
+      <w:pPr>
+        <w:pStyle w:val="MobileDetail"/>
+        <w:keepNext w:val="0"/>
+        <w:keepLines/>
+        <w:widowControl/>
+      </w:pPr>
+      <w:r>
+        <w:t>城市拥有造船厂时，本城每个渔场 +1 生产力。</w:t>
+      </w:r>
+    </w:p>
+    <w:p>
+      <w:pPr>
+        <w:pStyle w:val="MobileDetail"/>
+        <w:keepNext w:val="0"/>
+        <w:keepLines/>
+        <w:widowControl/>
+      </w:pPr>
+      <w:r>
+        <w:t>码头标准速度成本由 440 降为 360 生产力。</w:t>
+      </w:r>
+    </w:p>
+    <w:p>
+      <w:pPr>
+        <w:pStyle w:val="MobileDetail"/>
+        <w:keepNext w:val="0"/>
+        <w:keepLines/>
+        <w:widowControl/>
+      </w:pPr>
+      <w:r>
+        <w:t>码头解锁科技由“电力”提前至“蒸汽动力”。</w:t>
+      </w:r>
+    </w:p>
+    <w:p>
+      <w:pPr>
+        <w:pStyle w:val="Heading2"/>
+        <w:keepNext/>
+        <w:keepLines w:val="0"/>
+        <w:widowControl/>
+      </w:pPr>
+      <w:r>
         <w:t>工作坊</w:t>
       </w:r>
     </w:p>
@@ -586,7 +652,62 @@
         <w:widowControl/>
       </w:pPr>
       <w:r>
+        <w:t>军事工程师移动力提升为 4。</w:t>
+      </w:r>
+    </w:p>
+    <w:p>
+      <w:pPr>
+        <w:pStyle w:val="MobileDetail"/>
+        <w:keepNext w:val="0"/>
+        <w:keepLines/>
+        <w:widowControl/>
+      </w:pPr>
+      <w:r>
         <w:t>建造远古道路、古典时代道路、工业时代道路和现代道路不消耗建造次数，但每格消耗 1 点铁。</w:t>
+      </w:r>
+    </w:p>
+    <w:p>
+      <w:pPr>
+        <w:pStyle w:val="Heading2"/>
+        <w:keepNext/>
+        <w:keepLines w:val="0"/>
+        <w:widowControl/>
+      </w:pPr>
+      <w:r>
+        <w:t>战舰</w:t>
+      </w:r>
+    </w:p>
+    <w:p>
+      <w:pPr>
+        <w:pStyle w:val="MobileDetail"/>
+        <w:keepNext w:val="0"/>
+        <w:keepLines/>
+        <w:widowControl/>
+      </w:pPr>
+      <w:r>
+        <w:t>普通战舰近战战斗力改为 65。</w:t>
+      </w:r>
+    </w:p>
+    <w:p>
+      <w:pPr>
+        <w:pStyle w:val="MobileDetail"/>
+        <w:keepNext w:val="0"/>
+        <w:keepLines/>
+        <w:widowControl/>
+      </w:pPr>
+      <w:r>
+        <w:t>普通战舰远程战斗力改为 75。</w:t>
+      </w:r>
+    </w:p>
+    <w:p>
+      <w:pPr>
+        <w:pStyle w:val="MobileDetail"/>
+        <w:keepNext w:val="0"/>
+        <w:keepLines/>
+        <w:widowControl/>
+      </w:pPr>
+      <w:r>
+        <w:t>解锁科技不改；风云变幻规则集中仍由“精炼”解锁。</w:t>
       </w:r>
     </w:p>
     <w:p>
@@ -1616,7 +1737,7 @@
         <w:widowControl/>
       </w:pPr>
       <w:r>
-        <w:t>只能建在海岸单元格。</w:t>
+        <w:t>必须建在与海洋资源相邻的海岸单元格。</w:t>
       </w:r>
     </w:p>
     <w:p>
@@ -1627,7 +1748,7 @@
         <w:widowControl/>
       </w:pPr>
       <w:r>
-        <w:t>基础 +1 食物。</w:t>
+        <w:t>可以建在礁石上，但仍要求相邻海洋资源。</w:t>
       </w:r>
     </w:p>
     <w:p>
@@ -1638,7 +1759,7 @@
         <w:widowControl/>
       </w:pPr>
       <w:r>
-        <w:t>每相邻一个海洋资源，额外 +1 食物。</w:t>
+        <w:t>基础 +1 食物。</w:t>
       </w:r>
     </w:p>
     <w:p>
@@ -1649,7 +1770,7 @@
         <w:widowControl/>
       </w:pPr>
       <w:r>
-        <w:t>住房由 +0.5 提高到 +1。</w:t>
+        <w:t>每相邻一个海洋资源，额外 +1 食物。</w:t>
       </w:r>
     </w:p>
     <w:p>
@@ -1660,6 +1781,17 @@
         <w:widowControl/>
       </w:pPr>
       <w:r>
+        <w:t>住房由 +0.5 提高到 +1。</w:t>
+      </w:r>
+    </w:p>
+    <w:p>
+      <w:pPr>
+        <w:pStyle w:val="MobileDetail"/>
+        <w:keepNext w:val="0"/>
+        <w:keepLines/>
+        <w:widowControl/>
+      </w:pPr>
+      <w:r>
         <w:t>城市拥有造船厂时，每个渔场 +1 生产力。</w:t>
       </w:r>
     </w:p>
@@ -2039,6 +2171,50 @@
     </w:p>
     <w:p>
       <w:pPr>
+        <w:pStyle w:val="MobileDetail"/>
+        <w:keepNext w:val="0"/>
+        <w:keepLines/>
+        <w:widowControl/>
+      </w:pPr>
+      <w:r>
+        <w:t>甘榜屋解锁科技由“造船术”提前至“天文导航”。</w:t>
+      </w:r>
+    </w:p>
+    <w:p>
+      <w:pPr>
+        <w:pStyle w:val="MobileDetail"/>
+        <w:keepNext w:val="0"/>
+        <w:keepLines/>
+        <w:widowControl/>
+      </w:pPr>
+      <w:r>
+        <w:t>甘榜屋基础提供 +1 食物、+1 住房；每相邻 1 座渔船额外 +1 生产力、+1 信仰。</w:t>
+      </w:r>
+    </w:p>
+    <w:p>
+      <w:pPr>
+        <w:pStyle w:val="MobileDetail"/>
+        <w:keepNext w:val="0"/>
+        <w:keepLines/>
+        <w:widowControl/>
+      </w:pPr>
+      <w:r>
+        <w:t>“大规模生产”后额外 +1 住房，“土木工程”后额外 +1 食物；“飞行”后按额外生产力产出提供旅游业绩。</w:t>
+      </w:r>
+    </w:p>
+    <w:p>
+      <w:pPr>
+        <w:pStyle w:val="MobileDetail"/>
+        <w:keepNext w:val="0"/>
+        <w:keepLines/>
+        <w:widowControl/>
+      </w:pPr>
+      <w:r>
+        <w:t>甘榜屋可以建在礁石上，但仍要求相邻海洋资源。</w:t>
+      </w:r>
+    </w:p>
+    <w:p>
+      <w:pPr>
         <w:pStyle w:val="Heading1"/>
         <w:keepNext/>
         <w:keepLines w:val="0"/>
@@ -2331,7 +2507,7 @@
         <w:widowControl/>
       </w:pPr>
       <w:r>
-        <w:t>平伽拉：5 回合。</w:t>
+        <w:t>平伽拉：3 回合。</w:t>
       </w:r>
     </w:p>
     <w:p>
@@ -3485,7 +3661,7 @@
         <w:widowControl/>
       </w:pPr>
       <w:r>
-        <w:t>使用印度尼西亚确认圣地从每个相邻海岸或湖泊单元格获得 +1 信仰。</w:t>
+        <w:t>使用印度尼西亚确认圣地从每个相邻海岸或湖泊单元格获得 +1 信仰；确认甘榜屋的基础食物/住房、相邻渔船的生产力/信仰，以及大规模生产、土木工程和飞行后的附加效果。</w:t>
       </w:r>
     </w:p>
     <w:p>

</xml_diff>

<commit_message>
Release ZYL Lightweight Balance 0.7.2
</commit_message>
<xml_diff>
--- a/ZYL_LightweightBalance/docs/ZYL轻量化平衡模组_修改大全_微信版_无编号版.docx
+++ b/ZYL_LightweightBalance/docs/ZYL轻量化平衡模组_修改大全_微信版_无编号版.docx
@@ -38,7 +38,7 @@
         <w:widowControl/>
       </w:pPr>
       <w:r>
-        <w:t>当前版本：0.7.0</w:t>
+        <w:t>当前版本：0.7.2</w:t>
       </w:r>
     </w:p>
     <w:p>
@@ -267,7 +267,7 @@
         <w:widowControl/>
       </w:pPr>
       <w:r>
-        <w:t>百花齐放</w:t>
+        <w:t>天文导航</w:t>
       </w:r>
     </w:p>
     <w:p>
@@ -289,7 +289,7 @@
         <w:widowControl/>
       </w:pPr>
       <w:r>
-        <w:t>每个区域 +1 文化。</w:t>
+        <w:t>只允许商人上船；其他普通陆地单位需要“造船术”。</w:t>
       </w:r>
     </w:p>
     <w:p>
@@ -311,7 +311,7 @@
         <w:widowControl/>
       </w:pPr>
       <w:r>
-        <w:t>每个特色区域 +2 文化、+1 生产力、+2 金币。</w:t>
+        <w:t>允许所有陆地单位上船，包括开拓者和军事单位。</w:t>
       </w:r>
     </w:p>
     <w:p>
@@ -322,7 +322,18 @@
         <w:widowControl/>
       </w:pPr>
       <w:r>
-        <w:t>商业中心</w:t>
+        <w:t>百花齐放</w:t>
+      </w:r>
+    </w:p>
+    <w:p>
+      <w:pPr>
+        <w:pStyle w:val="Heading3"/>
+        <w:keepNext/>
+        <w:keepLines w:val="0"/>
+        <w:widowControl/>
+      </w:pPr>
+      <w:r>
+        <w:t>原版</w:t>
       </w:r>
     </w:p>
     <w:p>
@@ -333,7 +344,18 @@
         <w:widowControl/>
       </w:pPr>
       <w:r>
-        <w:t>商业中心每相邻一个奢侈资源，获得 +2 金币相邻加成。</w:t>
+        <w:t>每个区域 +1 文化。</w:t>
+      </w:r>
+    </w:p>
+    <w:p>
+      <w:pPr>
+        <w:pStyle w:val="Heading3"/>
+        <w:keepNext/>
+        <w:keepLines w:val="0"/>
+        <w:widowControl/>
+      </w:pPr>
+      <w:r>
+        <w:t>当前</w:t>
       </w:r>
     </w:p>
     <w:p>
@@ -344,7 +366,7 @@
         <w:widowControl/>
       </w:pPr>
       <w:r>
-        <w:t>所有商业中心特色替代区域同样生效。</w:t>
+        <w:t>每个特色区域 +2 文化、+1 生产力、+2 金币。</w:t>
       </w:r>
     </w:p>
     <w:p>
@@ -355,6 +377,39 @@
         <w:widowControl/>
       </w:pPr>
       <w:r>
+        <w:t>商业中心</w:t>
+      </w:r>
+    </w:p>
+    <w:p>
+      <w:pPr>
+        <w:pStyle w:val="MobileDetail"/>
+        <w:keepNext w:val="0"/>
+        <w:keepLines/>
+        <w:widowControl/>
+      </w:pPr>
+      <w:r>
+        <w:t>商业中心每相邻一个奢侈资源，获得 +2 金币相邻加成。</w:t>
+      </w:r>
+    </w:p>
+    <w:p>
+      <w:pPr>
+        <w:pStyle w:val="MobileDetail"/>
+        <w:keepNext w:val="0"/>
+        <w:keepLines/>
+        <w:widowControl/>
+      </w:pPr>
+      <w:r>
+        <w:t>所有商业中心特色替代区域同样生效。</w:t>
+      </w:r>
+    </w:p>
+    <w:p>
+      <w:pPr>
+        <w:pStyle w:val="Heading2"/>
+        <w:keepNext/>
+        <w:keepLines w:val="0"/>
+        <w:widowControl/>
+      </w:pPr>
+      <w:r>
         <w:t>银行</w:t>
       </w:r>
     </w:p>
@@ -862,6 +917,237 @@
       </w:pPr>
       <w:r>
         <w:t>信奉该万神殿的城市中，种植园 +1 食物、+2 金币。</w:t>
+      </w:r>
+    </w:p>
+    <w:p>
+      <w:pPr>
+        <w:pStyle w:val="Heading3"/>
+        <w:keepNext/>
+        <w:keepLines w:val="0"/>
+        <w:widowControl/>
+      </w:pPr>
+      <w:r>
+        <w:t>地灵契约</w:t>
+      </w:r>
+    </w:p>
+    <w:p>
+      <w:pPr>
+        <w:pStyle w:val="MobileDetail"/>
+        <w:keepNext w:val="0"/>
+        <w:keepLines/>
+        <w:widowControl/>
+      </w:pPr>
+      <w:r>
+        <w:t>购买单元格的费用降低 50%。</w:t>
+      </w:r>
+    </w:p>
+    <w:p>
+      <w:pPr>
+        <w:pStyle w:val="Heading3"/>
+        <w:keepNext/>
+        <w:keepLines w:val="0"/>
+        <w:widowControl/>
+      </w:pPr>
+      <w:r>
+        <w:t>花园女神</w:t>
+      </w:r>
+    </w:p>
+    <w:p>
+      <w:pPr>
+        <w:pStyle w:val="MobileDetail"/>
+        <w:keepNext w:val="0"/>
+        <w:keepLines/>
+        <w:widowControl/>
+      </w:pPr>
+      <w:r>
+        <w:t>信奉该万神殿的城市中，种植园 +1 科技、+2 金币。</w:t>
+      </w:r>
+    </w:p>
+    <w:p>
+      <w:pPr>
+        <w:pStyle w:val="Heading3"/>
+        <w:keepNext/>
+        <w:keepLines w:val="0"/>
+        <w:widowControl/>
+      </w:pPr>
+      <w:r>
+        <w:t>财富女神</w:t>
+      </w:r>
+    </w:p>
+    <w:p>
+      <w:pPr>
+        <w:pStyle w:val="MobileDetail"/>
+        <w:keepNext w:val="0"/>
+        <w:keepLines/>
+        <w:widowControl/>
+      </w:pPr>
+      <w:r>
+        <w:t>研究“制陶术”后即可建造商业中心。</w:t>
+      </w:r>
+    </w:p>
+    <w:p>
+      <w:pPr>
+        <w:pStyle w:val="MobileDetail"/>
+        <w:keepNext w:val="0"/>
+        <w:keepLines/>
+        <w:widowControl/>
+      </w:pPr>
+      <w:r>
+        <w:t>信奉该万神殿的城市中，与商业中心相邻的奢侈资源单元格 +2 金币。</w:t>
+      </w:r>
+    </w:p>
+    <w:p>
+      <w:pPr>
+        <w:pStyle w:val="Heading3"/>
+        <w:keepNext/>
+        <w:keepLines w:val="0"/>
+        <w:widowControl/>
+      </w:pPr>
+      <w:r>
+        <w:t>贸易之神</w:t>
+      </w:r>
+    </w:p>
+    <w:p>
+      <w:pPr>
+        <w:pStyle w:val="MobileDetail"/>
+        <w:keepNext w:val="0"/>
+        <w:keepLines/>
+        <w:widowControl/>
+      </w:pPr>
+      <w:r>
+        <w:t>所有贸易路线 +1 生产力。</w:t>
+      </w:r>
+    </w:p>
+    <w:p>
+      <w:pPr>
+        <w:pStyle w:val="MobileDetail"/>
+        <w:keepNext w:val="0"/>
+        <w:keepLines/>
+        <w:widowControl/>
+      </w:pPr>
+      <w:r>
+        <w:t>购买商人的费用降低 50%。</w:t>
+      </w:r>
+    </w:p>
+    <w:p>
+      <w:pPr>
+        <w:pStyle w:val="Heading3"/>
+        <w:keepNext/>
+        <w:keepLines w:val="0"/>
+        <w:widowControl/>
+      </w:pPr>
+      <w:r>
+        <w:t>征战之路</w:t>
+      </w:r>
+    </w:p>
+    <w:p>
+      <w:pPr>
+        <w:pStyle w:val="MobileDetail"/>
+        <w:keepNext w:val="0"/>
+        <w:keepLines/>
+        <w:widowControl/>
+      </w:pPr>
+      <w:r>
+        <w:t>军营及特色军营 +1 生产力、+2 文化、+2 金币。</w:t>
+      </w:r>
+    </w:p>
+    <w:p>
+      <w:pPr>
+        <w:pStyle w:val="Heading3"/>
+        <w:keepNext/>
+        <w:keepLines w:val="0"/>
+        <w:widowControl/>
+      </w:pPr>
+      <w:r>
+        <w:t>神圣碑文</w:t>
+      </w:r>
+    </w:p>
+    <w:p>
+      <w:pPr>
+        <w:pStyle w:val="MobileDetail"/>
+        <w:keepNext w:val="0"/>
+        <w:keepLines/>
+        <w:widowControl/>
+      </w:pPr>
+      <w:r>
+        <w:t>拥有纪念碑或旧神方尖碑的城市 +3 信仰。</w:t>
+      </w:r>
+    </w:p>
+    <w:p>
+      <w:pPr>
+        <w:pStyle w:val="Heading3"/>
+        <w:keepNext/>
+        <w:keepLines w:val="0"/>
+        <w:widowControl/>
+      </w:pPr>
+      <w:r>
+        <w:t>仓廪之神</w:t>
+      </w:r>
+    </w:p>
+    <w:p>
+      <w:pPr>
+        <w:pStyle w:val="MobileDetail"/>
+        <w:keepNext w:val="0"/>
+        <w:keepLines/>
+        <w:widowControl/>
+      </w:pPr>
+      <w:r>
+        <w:t>拥有粮仓的城市 +1 文化、+1 金币、+1 信仰。</w:t>
+      </w:r>
+    </w:p>
+    <w:p>
+      <w:pPr>
+        <w:pStyle w:val="Heading3"/>
+        <w:keepNext/>
+        <w:keepLines w:val="0"/>
+        <w:widowControl/>
+      </w:pPr>
+      <w:r>
+        <w:t>地热之神</w:t>
+      </w:r>
+    </w:p>
+    <w:p>
+      <w:pPr>
+        <w:pStyle w:val="MobileDetail"/>
+        <w:keepNext w:val="0"/>
+        <w:keepLines/>
+        <w:widowControl/>
+      </w:pPr>
+      <w:r>
+        <w:t>信奉该万神殿的城市中，地热裂缝 +2 文化。</w:t>
+      </w:r>
+    </w:p>
+    <w:p>
+      <w:pPr>
+        <w:pStyle w:val="Heading3"/>
+        <w:keepNext/>
+        <w:keepLines w:val="0"/>
+        <w:widowControl/>
+      </w:pPr>
+      <w:r>
+        <w:t>水流之神</w:t>
+      </w:r>
+    </w:p>
+    <w:p>
+      <w:pPr>
+        <w:pStyle w:val="MobileDetail"/>
+        <w:keepNext w:val="0"/>
+        <w:keepLines/>
+        <w:widowControl/>
+      </w:pPr>
+      <w:r>
+        <w:t>学院、圣地、商业中心、工业区和剧院广场从河流获得额外标准相邻加成。</w:t>
+      </w:r>
+    </w:p>
+    <w:p>
+      <w:pPr>
+        <w:pStyle w:val="MobileDetail"/>
+        <w:keepNext w:val="0"/>
+        <w:keepLines/>
+        <w:widowControl/>
+      </w:pPr>
+      <w:r>
+        <w:t>与河流相邻时，分别获得 +1 科技、+1 信仰、+1 金币、+1 生产力或 +1 文化相邻加成。</w:t>
       </w:r>
     </w:p>
     <w:p>
@@ -3606,7 +3892,7 @@
         <w:widowControl/>
       </w:pPr>
       <w:r>
-        <w:t>在新游戏中确认 5 个新增万神殿均可显示、选择并生效。</w:t>
+        <w:t>在新游戏中确认 14 个新增万神殿均可显示、选择并生效。</w:t>
       </w:r>
     </w:p>
     <w:p>

</xml_diff>

<commit_message>
Release ZYL Lightweight Balance 0.7.3
</commit_message>
<xml_diff>
--- a/ZYL_LightweightBalance/docs/ZYL轻量化平衡模组_修改大全_微信版_无编号版.docx
+++ b/ZYL_LightweightBalance/docs/ZYL轻量化平衡模组_修改大全_微信版_无编号版.docx
@@ -38,7 +38,7 @@
         <w:widowControl/>
       </w:pPr>
       <w:r>
-        <w:t>当前版本：0.7.2</w:t>
+        <w:t>当前版本：0.7.3</w:t>
       </w:r>
     </w:p>
     <w:p>
@@ -1148,6 +1148,138 @@
       </w:pPr>
       <w:r>
         <w:t>与河流相邻时，分别获得 +1 科技、+1 信仰、+1 金币、+1 生产力或 +1 文化相邻加成。</w:t>
+      </w:r>
+    </w:p>
+    <w:p>
+      <w:pPr>
+        <w:pStyle w:val="Heading3"/>
+        <w:keepNext/>
+        <w:keepLines w:val="0"/>
+        <w:widowControl/>
+      </w:pPr>
+      <w:r>
+        <w:t>礁石天堂</w:t>
+      </w:r>
+    </w:p>
+    <w:p>
+      <w:pPr>
+        <w:pStyle w:val="MobileDetail"/>
+        <w:keepNext w:val="0"/>
+        <w:keepLines/>
+        <w:widowControl/>
+      </w:pPr>
+      <w:r>
+        <w:t>信奉该万神殿的城市中，礁石 +1 食物、+1 文化。</w:t>
+      </w:r>
+    </w:p>
+    <w:p>
+      <w:pPr>
+        <w:pStyle w:val="Heading3"/>
+        <w:keepNext/>
+        <w:keepLines w:val="0"/>
+        <w:widowControl/>
+      </w:pPr>
+      <w:r>
+        <w:t>深海巨兽</w:t>
+      </w:r>
+    </w:p>
+    <w:p>
+      <w:pPr>
+        <w:pStyle w:val="MobileDetail"/>
+        <w:keepNext w:val="0"/>
+        <w:keepLines/>
+        <w:widowControl/>
+      </w:pPr>
+      <w:r>
+        <w:t>信奉该万神殿的城市中，鲸鱼和鲨鱼 +2 文化。</w:t>
+      </w:r>
+    </w:p>
+    <w:p>
+      <w:pPr>
+        <w:pStyle w:val="Heading3"/>
+        <w:keepNext/>
+        <w:keepLines w:val="0"/>
+        <w:widowControl/>
+      </w:pPr>
+      <w:r>
+        <w:t>海妖塞壬</w:t>
+      </w:r>
+    </w:p>
+    <w:p>
+      <w:pPr>
+        <w:pStyle w:val="MobileDetail"/>
+        <w:keepNext w:val="0"/>
+        <w:keepLines/>
+        <w:widowControl/>
+      </w:pPr>
+      <w:r>
+        <w:t>信奉该万神殿的城市中，所有水域单元格 +1 信仰。</w:t>
+      </w:r>
+    </w:p>
+    <w:p>
+      <w:pPr>
+        <w:pStyle w:val="Heading3"/>
+        <w:keepNext/>
+        <w:keepLines w:val="0"/>
+        <w:widowControl/>
+      </w:pPr>
+      <w:r>
+        <w:t>灯塔之光</w:t>
+      </w:r>
+    </w:p>
+    <w:p>
+      <w:pPr>
+        <w:pStyle w:val="MobileDetail"/>
+        <w:keepNext w:val="0"/>
+        <w:keepLines/>
+        <w:widowControl/>
+      </w:pPr>
+      <w:r>
+        <w:t>信奉该万神殿且拥有普通灯塔的城市 +2 文化。</w:t>
+      </w:r>
+    </w:p>
+    <w:p>
+      <w:pPr>
+        <w:pStyle w:val="MobileDetail"/>
+        <w:keepNext w:val="0"/>
+        <w:keepLines/>
+        <w:widowControl/>
+      </w:pPr>
+      <w:r>
+        <w:t>不包含灯塔特色替代建筑。</w:t>
+      </w:r>
+    </w:p>
+    <w:p>
+      <w:pPr>
+        <w:pStyle w:val="Heading3"/>
+        <w:keepNext/>
+        <w:keepLines w:val="0"/>
+        <w:widowControl/>
+      </w:pPr>
+      <w:r>
+        <w:t>棕榈滩</w:t>
+      </w:r>
+    </w:p>
+    <w:p>
+      <w:pPr>
+        <w:pStyle w:val="MobileDetail"/>
+        <w:keepNext w:val="0"/>
+        <w:keepLines/>
+        <w:widowControl/>
+      </w:pPr>
+      <w:r>
+        <w:t>位于或相邻海岸或湖泊单元格的所有区域 +1 文化、+1 金币。</w:t>
+      </w:r>
+    </w:p>
+    <w:p>
+      <w:pPr>
+        <w:pStyle w:val="MobileDetail"/>
+        <w:keepNext w:val="0"/>
+        <w:keepLines/>
+        <w:widowControl/>
+      </w:pPr>
+      <w:r>
+        <w:t>海岸/湖泊判定沿用南马都尔；市中心、专业化区域和所有非专业化区域均包含在内。</w:t>
       </w:r>
     </w:p>
     <w:p>
@@ -1795,17 +1927,7 @@
         <w:widowControl/>
       </w:pPr>
       <w:r>
-        <w:t>矿山</w:t>
-      </w:r>
-    </w:p>
-    <w:p>
-      <w:pPr>
-        <w:keepNext w:val="0"/>
-        <w:keepLines/>
-        <w:widowControl/>
-      </w:pPr>
-      <w:r>
-        <w:t>地热矿山仅在风云变幻规则集中生效。</w:t>
+        <w:t>海洋资源</w:t>
       </w:r>
     </w:p>
     <w:p>
@@ -1816,7 +1938,7 @@
         <w:widowControl/>
       </w:pPr>
       <w:r>
-        <w:t>解锁“采矿业”后，可以在地热裂缝上修建矿山。</w:t>
+        <w:t>鱼：加成资源，+1 食物，可以生成在礁石上。</w:t>
       </w:r>
     </w:p>
     <w:p>
@@ -1827,7 +1949,73 @@
         <w:widowControl/>
       </w:pPr>
       <w:r>
-        <w:t>矿山不会移除地热裂缝及其科技产出。</w:t>
+        <w:t>螃蟹：加成资源，+1 生产力、+1 金币，不能生成在礁石上。</w:t>
+      </w:r>
+    </w:p>
+    <w:p>
+      <w:pPr>
+        <w:pStyle w:val="MobileDetail"/>
+        <w:keepNext w:val="0"/>
+        <w:keepLines/>
+        <w:widowControl/>
+      </w:pPr>
+      <w:r>
+        <w:t>珍珠：奢侈资源，+1 食物、+1 信仰，不能生成在礁石上。</w:t>
+      </w:r>
+    </w:p>
+    <w:p>
+      <w:pPr>
+        <w:pStyle w:val="MobileDetail"/>
+        <w:keepNext w:val="0"/>
+        <w:keepLines/>
+        <w:widowControl/>
+      </w:pPr>
+      <w:r>
+        <w:t>鲨鱼：新增海洋奢侈资源，+1 食物、+1 金币，只生成在海岸，不能生成在湖泊或礁石上，可由渔船改良；使用 Sukritact 的专用地图模型和图标。</w:t>
+      </w:r>
+    </w:p>
+    <w:p>
+      <w:pPr>
+        <w:pStyle w:val="MobileDetail"/>
+        <w:keepNext w:val="0"/>
+        <w:keepLines/>
+        <w:widowControl/>
+      </w:pPr>
+      <w:r>
+        <w:t>开启“垄断与行业”时，鲨鱼行业和企业均使平民单位建造时 +30% 生产力。企业可花 500 生产力创建产品；产品提供 +3 食物、1 旅游业绩及同一生产力效果。</w:t>
+      </w:r>
+    </w:p>
+    <w:p>
+      <w:pPr>
+        <w:pStyle w:val="MobileDetail"/>
+        <w:keepNext w:val="0"/>
+        <w:keepLines/>
+        <w:widowControl/>
+      </w:pPr>
+      <w:r>
+        <w:t>鲸鱼：奢侈资源，+1 生产力、+1 金币，不能生成在礁石上。</w:t>
+      </w:r>
+    </w:p>
+    <w:p>
+      <w:pPr>
+        <w:pStyle w:val="MobileDetail"/>
+        <w:keepNext w:val="0"/>
+        <w:keepLines/>
+        <w:widowControl/>
+      </w:pPr>
+      <w:r>
+        <w:t>海龟：奢侈资源，+1 科技，只生成在礁石上。</w:t>
+      </w:r>
+    </w:p>
+    <w:p>
+      <w:pPr>
+        <w:pStyle w:val="MobileDetail"/>
+        <w:keepNext w:val="0"/>
+        <w:keepLines/>
+        <w:widowControl/>
+      </w:pPr>
+      <w:r>
+        <w:t>琥珀：奢侈资源，+1 文化，改为只生成在海岸礁石上，不再进入陆地资源池。</w:t>
       </w:r>
     </w:p>
     <w:p>
@@ -1838,6 +2026,49 @@
         <w:widowControl/>
       </w:pPr>
       <w:r>
+        <w:t>矿山</w:t>
+      </w:r>
+    </w:p>
+    <w:p>
+      <w:pPr>
+        <w:keepNext w:val="0"/>
+        <w:keepLines/>
+        <w:widowControl/>
+      </w:pPr>
+      <w:r>
+        <w:t>地热矿山仅在风云变幻规则集中生效。</w:t>
+      </w:r>
+    </w:p>
+    <w:p>
+      <w:pPr>
+        <w:pStyle w:val="MobileDetail"/>
+        <w:keepNext w:val="0"/>
+        <w:keepLines/>
+        <w:widowControl/>
+      </w:pPr>
+      <w:r>
+        <w:t>解锁“采矿业”后，可以在地热裂缝上修建矿山。</w:t>
+      </w:r>
+    </w:p>
+    <w:p>
+      <w:pPr>
+        <w:pStyle w:val="MobileDetail"/>
+        <w:keepNext w:val="0"/>
+        <w:keepLines/>
+        <w:widowControl/>
+      </w:pPr>
+      <w:r>
+        <w:t>矿山不会移除地热裂缝及其科技产出。</w:t>
+      </w:r>
+    </w:p>
+    <w:p>
+      <w:pPr>
+        <w:pStyle w:val="Heading2"/>
+        <w:keepNext/>
+        <w:keepLines w:val="0"/>
+        <w:widowControl/>
+      </w:pPr>
+      <w:r>
         <w:t>渔船</w:t>
       </w:r>
     </w:p>
@@ -2683,7 +2914,29 @@
         <w:widowControl/>
       </w:pPr>
       <w:r>
-        <w:t>海岸出生倾向判断已修正；海岸文明正常靠海，其他文明强烈偏好内陆。</w:t>
+        <w:t xml:space="preserve">礁石基础生成比例由 </w:t>
+      </w:r>
+      <w:r>
+        <w:rPr>
+          <w:rFonts w:ascii="Consolas" w:hAnsi="Consolas" w:eastAsia="Microsoft YaHei"/>
+          <w:color w:val="1F4D78"/>
+          <w:sz w:val="22"/>
+        </w:rPr>
+        <w:t>8 + 富饶度 / 1.5</w:t>
+      </w:r>
+      <w:r>
+        <w:t xml:space="preserve"> 提升为 </w:t>
+      </w:r>
+      <w:r>
+        <w:rPr>
+          <w:rFonts w:ascii="Consolas" w:hAnsi="Consolas" w:eastAsia="Microsoft YaHei"/>
+          <w:color w:val="1F4D78"/>
+          <w:sz w:val="22"/>
+        </w:rPr>
+        <w:t>10 + 富饶度 / 1.5</w:t>
+      </w:r>
+      <w:r>
+        <w:t>。</w:t>
       </w:r>
     </w:p>
     <w:p>
@@ -2694,7 +2947,7 @@
         <w:widowControl/>
       </w:pPr>
       <w:r>
-        <w:t>南北区域不再被坐标规则错误视为虚拟冻土，普通文明可以正常使用没有真实冻土的高纬区域。</w:t>
+        <w:t>海岸出生倾向判断已修正；海岸文明正常靠海，其他文明强烈偏好内陆。</w:t>
       </w:r>
     </w:p>
     <w:p>
@@ -2705,7 +2958,7 @@
         <w:widowControl/>
       </w:pPr>
       <w:r>
-        <w:t>分队越界扣分由 9000 万提高到 1.2 亿，普通文明更难出生到对方区域。</w:t>
+        <w:t>南北区域不再被坐标规则错误视为虚拟冻土，普通文明可以正常使用没有真实冻土的高纬区域。</w:t>
       </w:r>
     </w:p>
     <w:p>
@@ -2716,7 +2969,7 @@
         <w:widowControl/>
       </w:pPr>
       <w:r>
-        <w:t>不再生成纬度冰盖和远洋冰岛。</w:t>
+        <w:t>分队越界扣分由 9000 万提高到 1.2 亿，普通文明更难出生到对方区域。</w:t>
       </w:r>
     </w:p>
     <w:p>
@@ -2727,7 +2980,7 @@
         <w:widowControl/>
       </w:pPr>
       <w:r>
-        <w:t>地图仍遵循本模组的最多 7 个宗教和地脉密度 +20% 规则。</w:t>
+        <w:t>不再生成纬度冰盖和远洋冰岛。</w:t>
       </w:r>
     </w:p>
     <w:p>
@@ -2738,7 +2991,7 @@
         <w:widowControl/>
       </w:pPr>
       <w:r>
-        <w:t>竞赛模式开关和“极多”战略资源档已修复；出生点重塑会保护全部战略资源与地脉，原地图中会阻止 Lua 加载的损坏日志也已修复。</w:t>
+        <w:t>地图仍遵循本模组的最多 7 个宗教和地脉密度 +20% 规则。</w:t>
       </w:r>
     </w:p>
     <w:p>
@@ -2749,7 +3002,7 @@
         <w:widowControl/>
       </w:pPr>
       <w:r>
-        <w:t>毛利水域出生格和地图边缘空相邻格不会再触发淡水修整崩溃。</w:t>
+        <w:t>竞赛模式开关和“极多”战略资源档已修复；出生点重塑会保护全部战略资源与地脉，原地图中会阻止 Lua 加载的损坏日志也已修复。</w:t>
       </w:r>
     </w:p>
     <w:p>
@@ -2760,6 +3013,17 @@
         <w:widowControl/>
       </w:pPr>
       <w:r>
+        <w:t>毛利水域出生格和地图边缘空相邻格不会再触发淡水修整崩溃。</w:t>
+      </w:r>
+    </w:p>
+    <w:p>
+      <w:pPr>
+        <w:pStyle w:val="MobileDetail"/>
+        <w:keepNext w:val="0"/>
+        <w:keepLines/>
+        <w:widowControl/>
+      </w:pPr>
+      <w:r>
         <w:t>原作者：千川白浪、号码菌、红魔族首席魔法师。</w:t>
       </w:r>
     </w:p>
@@ -3892,7 +4156,7 @@
         <w:widowControl/>
       </w:pPr>
       <w:r>
-        <w:t>在新游戏中确认 14 个新增万神殿均可显示、选择并生效。</w:t>
+        <w:t>在新游戏中确认 19 个新增万神殿均可显示、选择并生效。</w:t>
       </w:r>
     </w:p>
     <w:p>
@@ -3970,6 +4234,28 @@
       </w:pPr>
       <w:r>
         <w:t>确认新地图中的地脉密度相对原版提高约 20%；地脉、奢侈资源和战略资源可以在正确条件下收获，并在其上坐城时继续保留。</w:t>
+      </w:r>
+    </w:p>
+    <w:p>
+      <w:pPr>
+        <w:pStyle w:val="MobileDetail"/>
+        <w:keepNext w:val="0"/>
+        <w:keepLines/>
+        <w:widowControl/>
+      </w:pPr>
+      <w:r>
+        <w:t>确认鱼可生成在礁石上，螃蟹、珍珠、鲸鱼和鲨鱼不能；海龟和琥珀只能生成在礁石上，并确认鲨鱼可由渔船改良、正确显示专用美术。</w:t>
+      </w:r>
+    </w:p>
+    <w:p>
+      <w:pPr>
+        <w:pStyle w:val="MobileDetail"/>
+        <w:keepNext w:val="0"/>
+        <w:keepLines/>
+        <w:widowControl/>
+      </w:pPr>
+      <w:r>
+        <w:t>开启“垄断与行业”后确认鲨鱼行业、企业、产品项目及其平民单位生产力效果均正常生效；确认棕榈滩对沿海的所有区域类型生效。</w:t>
       </w:r>
     </w:p>
     <w:p>

</xml_diff>